<commit_message>
chore: sync repository with latest local architectural, naming, and governance updates
</commit_message>
<xml_diff>
--- a/04_Variants/Digital/Digital Marketing - Media Strategy Leadership.docx
+++ b/04_Variants/Digital/Digital Marketing - Media Strategy Leadership.docx
@@ -124,15 +124,7 @@
         <w:rPr>
           <w:rFonts w:asciiTheme="minorHAnsi" w:hAnsiTheme="minorHAnsi" w:cstheme="minorHAnsi"/>
         </w:rPr>
-        <w:t>Digital marketing, client partnerships, and integrated media strategy leader with 20 years of experience managing enterprise digital campaigns, regio</w:t>
-      </w:r>
-      <w:bookmarkStart w:id="0" w:name="_GoBack"/>
-      <w:bookmarkEnd w:id="0"/>
-      <w:r>
-        <w:rPr>
-          <w:rFonts w:asciiTheme="minorHAnsi" w:hAnsiTheme="minorHAnsi" w:cstheme="minorHAnsi"/>
-        </w:rPr>
-        <w:t>nal brand initiatives, and performance marketing programs across technology and media organizations. Proven expertise developing annual media strategies, leading integrated marketing communication programs, and managing cross-functional execution across Search, Social, Video, Programmatic, and Web platforms. Experienced managing $3M–$4M+ annual media investments while improving campaign performance, customer acquisition efficiency, conversion outcomes, and marketing ROI. Led teams of 5+ professionals and coordinated agencies, vendors, and regional stakeholders across APAC, EMEA, and Americas.</w:t>
+        <w:t>Digital marketing, client partnerships, and integrated media strategy leader with 20 years of experience managing enterprise digital campaigns, regional brand initiatives, and performance marketing programs across technology and media organizations. Proven expertise developing annual media strategies, leading integrated marketing communication programs, and managing cross-functional execution across Search, Social, Video, Programmatic, and Web platforms. Experienced managing $3M–$4M+ annual media investments while improving campaign performance, customer acquisition efficiency, conversion outcomes, and marketing ROI. Led teams of 5+ professionals and coordinated agencies, vendors, and regional stakeholders across APAC, EMEA, and Americas.</w:t>
       </w:r>
     </w:p>
     <w:p>
@@ -1000,12 +992,37 @@
           <w:szCs w:val="24"/>
         </w:rPr>
       </w:pPr>
-      <w:r>
+    </w:p>
+    <w:p>
+      <w:pPr>
+        <w:pStyle w:val="Heading2"/>
+        <w:spacing w:before="0" w:beforeAutospacing="0" w:after="0" w:afterAutospacing="0"/>
         <w:rPr>
           <w:rFonts w:asciiTheme="minorHAnsi" w:hAnsiTheme="minorHAnsi" w:cstheme="minorHAnsi"/>
           <w:sz w:val="24"/>
           <w:szCs w:val="24"/>
         </w:rPr>
+      </w:pPr>
+    </w:p>
+    <w:p>
+      <w:pPr>
+        <w:pStyle w:val="Heading2"/>
+        <w:spacing w:before="0" w:beforeAutospacing="0" w:after="0" w:afterAutospacing="0"/>
+        <w:rPr>
+          <w:rFonts w:asciiTheme="minorHAnsi" w:hAnsiTheme="minorHAnsi" w:cstheme="minorHAnsi"/>
+          <w:sz w:val="24"/>
+          <w:szCs w:val="24"/>
+        </w:rPr>
+      </w:pPr>
+      <w:bookmarkStart w:id="0" w:name="_GoBack"/>
+      <w:bookmarkEnd w:id="0"/>
+      <w:r>
+        <w:rPr>
+          <w:rFonts w:asciiTheme="minorHAnsi" w:hAnsiTheme="minorHAnsi" w:cstheme="minorHAnsi"/>
+          <w:sz w:val="24"/>
+          <w:szCs w:val="24"/>
+        </w:rPr>
+        <w:lastRenderedPageBreak/>
         <w:t>SELECTED STRATEGIC INITIATIVES</w:t>
       </w:r>
     </w:p>
@@ -1044,7 +1061,6 @@
         <w:rPr>
           <w:rFonts w:asciiTheme="minorHAnsi" w:hAnsiTheme="minorHAnsi" w:cstheme="minorHAnsi"/>
         </w:rPr>
-        <w:lastRenderedPageBreak/>
         <w:t>Led integrated APAC launch coordination for two regional brand initiatives involving digital media activation, stakeholder alignment, campaign governance, and cross-market execution.</w:t>
       </w:r>
     </w:p>

</xml_diff>